<commit_message>
docs(lab02): clarify student participation and AI collaboration
</commit_message>
<xml_diff>
--- a/lab02/report/2024311281_孙驰_实验作业二.docx
+++ b/lab02/report/2024311281_孙驰_实验作业二.docx
@@ -4067,8 +4067,8 @@
       <w:tblGrid>
         <w:gridCol w:w="530"/>
         <w:gridCol w:w="1450"/>
-        <w:gridCol w:w="3250"/>
-        <w:gridCol w:w="3728"/>
+        <w:gridCol w:w="3489"/>
+        <w:gridCol w:w="3489"/>
       </w:tblGrid>
       <w:tr>
         <w:trPr>
@@ -4123,13 +4123,13 @@
                 <w:i w:val="0"/>
                 <w:sz w:val="20"/>
               </w:rPr>
-              <w:t xml:space="preserve">使用场景</w:t>
+              <w:t xml:space="preserve">协作环节</w:t>
             </w:r>
           </w:p>
         </w:tc>
         <w:tc>
           <w:tcPr>
-            <w:tcW w:w="3250" w:type="dxa"/>
+            <w:tcW w:w="3489" w:type="dxa"/>
             <w:shd w:val="clear" w:color="auto" w:fill="ECFDF5"/>
             <w:vAlign w:val="center"/>
             <w:tcMar>
@@ -4149,13 +4149,13 @@
                 <w:i w:val="0"/>
                 <w:sz w:val="20"/>
               </w:rPr>
-              <w:t xml:space="preserve">提示词 / 操作原文（摘要）</w:t>
+              <w:t xml:space="preserve">我的参与与关注点</w:t>
             </w:r>
           </w:p>
         </w:tc>
         <w:tc>
           <w:tcPr>
-            <w:tcW w:w="3728" w:type="dxa"/>
+            <w:tcW w:w="3489" w:type="dxa"/>
             <w:shd w:val="clear" w:color="auto" w:fill="ECFDF5"/>
             <w:vAlign w:val="center"/>
             <w:tcMar>
@@ -4175,7 +4175,7 @@
                 <w:i w:val="0"/>
                 <w:sz w:val="20"/>
               </w:rPr>
-              <w:t xml:space="preserve">AI 输出与采纳、修改</w:t>
+              <w:t xml:space="preserve">Codex 辅助工作与反馈</w:t>
             </w:r>
           </w:p>
         </w:tc>
@@ -4230,13 +4230,13 @@
                 <w:color w:val="000000"/>
                 <w:sz w:val="22"/>
               </w:rPr>
-              <w:t xml:space="preserve">明确实验任务</w:t>
+              <w:t xml:space="preserve">明确任务依据</w:t>
             </w:r>
           </w:p>
         </w:tc>
         <w:tc>
           <w:tcPr>
-            <w:tcW w:w="3250" w:type="dxa"/>
+            <w:tcW w:w="3489" w:type="dxa"/>
             <w:vAlign w:val="center"/>
             <w:tcMar>
               <w:top w:w="55" w:type="dxa"/>
@@ -4255,13 +4255,13 @@
                 <w:color w:val="000000"/>
                 <w:sz w:val="22"/>
               </w:rPr>
-              <w:t xml:space="preserve">“按照课件要求完成实验二并上传git仓库”；随后指定作业二指南位置。</w:t>
+              <w:t xml:space="preserve">我指定作业二指南位置，要求按课件完成实验并上传Git；先完成实验，再按模板整理报告。</w:t>
             </w:r>
           </w:p>
         </w:tc>
         <w:tc>
           <w:tcPr>
-            <w:tcW w:w="3728" w:type="dxa"/>
+            <w:tcW w:w="3489" w:type="dxa"/>
             <w:vAlign w:val="center"/>
             <w:tcMar>
               <w:top w:w="55" w:type="dxa"/>
@@ -4280,7 +4280,7 @@
                 <w:color w:val="000000"/>
                 <w:sz w:val="22"/>
               </w:rPr>
-              <w:t xml:space="preserve">Codex读取指南，落实基线、六组对照、三次复测和图表；修正示例训练/测试重叠。</w:t>
+              <w:t xml:space="preserve">依据指南实现基线、六组对照与三次复测；检查并修正示例中的训练/测试重叠。</w:t>
             </w:r>
           </w:p>
         </w:tc>
@@ -4335,13 +4335,13 @@
                 <w:color w:val="000000"/>
                 <w:sz w:val="22"/>
               </w:rPr>
-              <w:t xml:space="preserve">HPC部署与调试</w:t>
+              <w:t xml:space="preserve">提供运行条件</w:t>
             </w:r>
           </w:p>
         </w:tc>
         <w:tc>
           <w:tcPr>
-            <w:tcW w:w="3250" w:type="dxa"/>
+            <w:tcW w:w="3489" w:type="dxa"/>
             <w:vAlign w:val="center"/>
             <w:tcMar>
               <w:top w:w="55" w:type="dxa"/>
@@ -4360,13 +4360,13 @@
                 <w:color w:val="000000"/>
                 <w:sz w:val="22"/>
               </w:rPr>
-              <w:t xml:space="preserve">“提供HPC高性能运算平台……本机已开通免密登录”。</w:t>
+              <w:t xml:space="preserve">我提供HPC平台文档和学号，说明本机已有免密登录条件，为正式训练提供可用环境。</w:t>
             </w:r>
           </w:p>
         </w:tc>
         <w:tc>
           <w:tcPr>
-            <w:tcW w:w="3728" w:type="dxa"/>
+            <w:tcW w:w="3489" w:type="dxa"/>
             <w:vAlign w:val="center"/>
             <w:tcMar>
               <w:top w:w="55" w:type="dxa"/>
@@ -4385,7 +4385,7 @@
                 <w:color w:val="000000"/>
                 <w:sz w:val="22"/>
               </w:rPr>
-              <w:t xml:space="preserve">使用现有SSH密钥和Slurm；探测A30及PyTorch环境。首次内存申请被拒后，核对节点配置并按平台示例修正。</w:t>
+              <w:t xml:space="preserve">连接既有环境并编排Slurm任务；定位内存申请失败原因，调整后在A30上完成训练。</w:t>
             </w:r>
           </w:p>
         </w:tc>
@@ -4440,13 +4440,13 @@
                 <w:color w:val="000000"/>
                 <w:sz w:val="22"/>
               </w:rPr>
-              <w:t xml:space="preserve">结果与代码核验</w:t>
+              <w:t xml:space="preserve">追问实验效果</w:t>
             </w:r>
           </w:p>
         </w:tc>
         <w:tc>
           <w:tcPr>
-            <w:tcW w:w="3250" w:type="dxa"/>
+            <w:tcW w:w="3489" w:type="dxa"/>
             <w:vAlign w:val="center"/>
             <w:tcMar>
               <w:top w:w="55" w:type="dxa"/>
@@ -4465,13 +4465,13 @@
                 <w:color w:val="000000"/>
                 <w:sz w:val="22"/>
               </w:rPr>
-              <w:t xml:space="preserve">“实验结果如何？是否符合预期？是否按照指导要求？”</w:t>
+              <w:t xml:space="preserve">我主动追问：“实验结果如何？是否符合预期？是否按照指导要求？”要求同时评价效果与完成情况。</w:t>
             </w:r>
           </w:p>
         </w:tc>
         <w:tc>
           <w:tcPr>
-            <w:tcW w:w="3728" w:type="dxa"/>
+            <w:tcW w:w="3489" w:type="dxa"/>
             <w:vAlign w:val="center"/>
             <w:tcMar>
               <w:top w:w="55" w:type="dxa"/>
@@ -4490,7 +4490,7 @@
                 <w:color w:val="000000"/>
                 <w:sz w:val="22"/>
               </w:rPr>
-              <w:t xml:space="preserve">核对指南、参数公式和原始预测；运行行为测试与独立审查，修正GPU计时同步，保留8帧无改善和L1近全黑结果。</w:t>
+              <w:t xml:space="preserve">核对要求、指标及预测图；解释8帧组未改善和L1近全黑现象，明确同种子复测的结论范围。</w:t>
             </w:r>
           </w:p>
         </w:tc>
@@ -4508,7 +4508,7 @@
           <w:color w:val="000000"/>
           <w:sz w:val="20"/>
         </w:rPr>
-        <w:t xml:space="preserve">表中引号内为本次真实指令节选。正式代码经参数公式、行为测试、独立审查和保存预测重算核验；协作工具如实记为Codex。</w:t>
+        <w:t xml:space="preserve">协作反思：实验评价应同时看误差、预测图和对照条件。8帧组与L1组未达到预期，说明训练完成或某项指标下降，都不足以证明改动有效。</w:t>
       </w:r>
     </w:p>
     <w:p>
@@ -5729,7 +5729,7 @@
           <w:color w:val="000000"/>
           <w:sz w:val="22"/>
         </w:rPr>
-        <w:t xml:space="preserve">本次AI的价值主要在于快速生成可运行框架、统一实验配置、编排HPC任务，以及发现数据重叠、设备不一致、计时不同步等工程问题。将参数推导转成可执行核对、把原始预测重算为指标，也降低了手工整理结果出错的概率。</w:t>
+        <w:t xml:space="preserve">我认为，AI最有价值的环节是把门控公式落实为可运行代码，并处理状态初始化、设备匹配、批量实验和指标整理等工作。本次协作中，我明确实验依据、提供HPC条件，并追问结果是否符合预期与指导要求；Codex承担代码实现、运行和核验，具体分工见第4节。</w:t>
       </w:r>
     </w:p>
     <w:p>
@@ -5744,7 +5744,7 @@
           <w:color w:val="000000"/>
           <w:sz w:val="22"/>
         </w:rPr>
-        <w:t xml:space="preserve">必须理解的部分包括四门的含义与激活函数、c和h的不同更新方式、卷积输入通道为何为C_in+C_h、四门输出为何为4C_h，以及时间轴和通道轴的区别。没有这些理解，即使代码能运行，也可能把全连接LSTM的时间长度误当输入维度，或把测试集泄漏造成的好结果误判为改进。</w:t>
+        <w:t xml:space="preserve">我需要理解的是四门分别控制什么、c与h为何采用不同更新方式，以及输入拼接后的通道数为何为C_in+C_h、四门输出为何为4C_h。参数核对还必须分清时间轴与特征轴：4帧不意味着input_size变成4096。只有能解释这些关系，才能判断生成代码是否符合模型原理；评价改进时也应结合数据划分和预测图，避免把泄漏或背景占优造成的低误差当作有效学习。</w:t>
       </w:r>
     </w:p>
     <w:p>

</xml_diff>

<commit_message>
docs(lab02): incorporate author-provided collaboration account
</commit_message>
<xml_diff>
--- a/lab02/report/2024311281_孙驰_实验作业二.docx
+++ b/lab02/report/2024311281_孙驰_实验作业二.docx
@@ -4230,7 +4230,7 @@
                 <w:color w:val="000000"/>
                 <w:sz w:val="22"/>
               </w:rPr>
-              <w:t xml:space="preserve">明确任务依据</w:t>
+              <w:t xml:space="preserve">核心实现与协作完善</w:t>
             </w:r>
           </w:p>
         </w:tc>
@@ -4255,7 +4255,7 @@
                 <w:color w:val="000000"/>
                 <w:sz w:val="22"/>
               </w:rPr>
-              <w:t xml:space="preserve">我指定作业二指南位置，要求按课件完成实验并上传Git；先完成实验，再按模板整理报告。</w:t>
+              <w:t xml:space="preserve">我自主编写核心代码，请Codex审查并协助改进；请其生成其余代码，并在指导下阅读、理解；协助远程HPC运行，运行后共同分析结果、撰写报告。</w:t>
             </w:r>
           </w:p>
         </w:tc>
@@ -4280,7 +4280,7 @@
                 <w:color w:val="000000"/>
                 <w:sz w:val="22"/>
               </w:rPr>
-              <w:t xml:space="preserve">依据指南实现基线、六组对照与三次复测；检查并修正示例中的训练/测试重叠。</w:t>
+              <w:t xml:space="preserve">审查核心代码并协助修改，生成其余代码并解释实现逻辑；指导远程运行，结合指标和预测图参与结果分析，共同整理报告。</w:t>
             </w:r>
           </w:p>
         </w:tc>
@@ -5729,7 +5729,7 @@
           <w:color w:val="000000"/>
           <w:sz w:val="22"/>
         </w:rPr>
-        <w:t xml:space="preserve">我认为，AI最有价值的环节是把门控公式落实为可运行代码，并处理状态初始化、设备匹配、批量实验和指标整理等工作。本次协作中，我明确实验依据、提供HPC条件，并追问结果是否符合预期与指导要求；Codex承担代码实现、运行和核验，具体分工见第4节。</w:t>
+        <w:t xml:space="preserve">我认为，AI最有价值的环节是代码审查、实现解释和工程调试。本次我自主编写核心代码，请Codex审查并协助改进；其余代码由Codex生成，我在指导下阅读、理解。我还协助远程HPC运行，运行后共同分析结果、撰写报告，具体分工见第4节。</w:t>
       </w:r>
     </w:p>
     <w:p>

</xml_diff>